<commit_message>
fix lots of bugs and error
</commit_message>
<xml_diff>
--- a/MyBahaya_FYP_Report.docx
+++ b/MyBahaya_FYP_Report.docx
@@ -1065,7 +1065,7 @@
           <w:sz w:val="24"/>
           <w:szCs w:val="24"/>
         </w:rPr>
-        <w:t xml:space="preserve">Emergency reporting in Malaysia remains heavily dependent on voice-based channels such as the 999 hotline, which require callers to verbally describe incidents, provide no facility for multimedia evidence, and rely on manual operator triage to route cases to the appropriate agency. These limitations introduce delays and the risk of miscommunication during time-critical situations. This project, MyBahaya, addresses these gaps by developing an AI-powered emergency reporting and real-time community alert platform tailored for Malaysia. The system comprises a Flutter-based mobile application for citizens, a web dashboard for emergency organizations, and a Spring Boot backend that integrates Firebase Firestore, MinIO object storage, Firebase Cloud Messaging, and the Google Gemini 2.5 Flash multimodal artificial intelligence model. Citizens submit reports containing photographs, an optional video, and automatically captured GPS coordinates. The backend stores the media, asynchronously analyses the imagery with Gemini to determine incident severity, generate a summary, identify hazards, and detect potentially fake reports, then routes the report to the nearest appropriate organization using the Haversine distance formula. Nearby citizens and the assigned organization are notified in real time through push notifications. The platform was developed using the Agile methodology and validated through sixteen functional, security, performance, and usability test cases, all of which passed. The results demonstrate that integrating mobile technology, cloud services, and multimodal AI can meaningfully improve the speed, richness, and accuracy of emergency reporting in Malaysia.</w:t>
+        <w:t xml:space="preserve">Emergency reporting in Malaysia remains heavily dependent on voice-based channels such as the 999 hotline, which require callers to verbally describe incidents and provide limited multimedia evidence. MyBahaya addresses this gap through a Flutter citizen application, a browser-based dashboard for authorized emergency organizations, and a Spring Boot backend integrating Firebase Firestore, MinIO object storage, Firebase Cloud Messaging, and Google Gemini 2.5 Flash. Citizens submit a category, photographs, optional video, location, and description. The backend stores the evidence, routes the report to a suitable nearby organization, and asynchronously enriches the report with AI-generated severity, summary, hazards, suggested category, and a possible-fake flag. The current web dashboard adds real-time report monitoring, status grouping into Active, En Route, and Solved views, unread-report indicators, live map filtering, analytics with timeframe selection and CSV export, organization and administrator management, report verification, and configurable browser alert sounds. The implemented system was reviewed through functional, integration, security, performance, and usability test cases, with results and limitations recorded in Chapter 6.</w:t>
       </w:r>
     </w:p>
     <w:p>
@@ -1102,7 +1102,7 @@
           <w:sz w:val="24"/>
           <w:szCs w:val="24"/>
         </w:rPr>
-        <w:t xml:space="preserve">Pelaporan kecemasan di Malaysia masih bergantung sepenuhnya kepada saluran berasaskan suara seperti talian 999, yang memerlukan pemanggil menerangkan kejadian secara lisan, tidak menyediakan kemudahan untuk bukti multimedia, dan bergantung kepada penilaian manual oleh operator untuk menghalakan kes kepada agensi yang sesuai. Keterbatasan ini menyebabkan kelewatan dan risiko salah faham dalam situasi yang kritikal masa. Projek ini, MyBahaya, menangani jurang tersebut dengan membangunkan sebuah platform pelaporan kecemasan dan amaran komuniti masa nyata berkuasa kecerdasan buatan (AI) yang dikhususkan untuk Malaysia. Sistem ini terdiri daripada aplikasi mudah alih berasaskan Flutter untuk orang awam, papan pemuka web untuk organisasi kecemasan, dan pelayan belakang Spring Boot yang menyepadukan Firebase Firestore, storan objek MinIO, Firebase Cloud Messaging, serta model kecerdasan buatan multimodal Google Gemini 2.5 Flash. Orang awam menghantar laporan yang mengandungi gambar, video pilihan, dan koordinat GPS yang ditangkap secara automatik. Pelayan belakang menyimpan media tersebut, menganalisis imej secara tak segerak menggunakan Gemini untuk menentukan tahap keterukan, menjana ringkasan, mengenal pasti bahaya, dan mengesan laporan palsu, kemudian menghalakan laporan kepada organisasi terdekat yang sesuai menggunakan formula jarak Haversine. Orang awam berhampiran dan organisasi yang ditugaskan dimaklumkan secara masa nyata melalui pemberitahuan tolak. Platform ini dibangunkan menggunakan metodologi Agile dan disahkan melalui enam belas kes ujian fungsian, keselamatan, prestasi, dan kebolehgunaan, yang kesemuanya lulus. Hasil kajian menunjukkan bahawa penyepaduan teknologi mudah alih, perkhidmatan awan, dan AI multimodal dapat meningkatkan kelajuan, kekayaan maklumat, dan ketepatan pelaporan kecemasan di Malaysia secara bermakna.</w:t>
+        <w:t xml:space="preserve">Pelaporan kecemasan di Malaysia masih banyak bergantung kepada saluran suara seperti talian 999 yang memerlukan penerangan lisan dan memberikan bukti multimedia yang terhad. MyBahaya menangani jurang ini melalui aplikasi Flutter untuk orang awam, papan pemuka pelayar untuk organisasi kecemasan yang diberi kuasa, dan pelayan belakang Spring Boot yang menyepadukan Firebase Firestore, storan objek MinIO, Firebase Cloud Messaging, serta Google Gemini 2.5 Flash. Orang awam menghantar kategori, gambar, video pilihan, lokasi, dan penerangan. Pelayan belakang menyimpan bukti, menghalakan laporan kepada organisasi yang sesuai berdekatan, dan memperkayakan laporan secara tak segerak dengan tahap keterukan, ringkasan, bahaya, kategori cadangan, serta penanda kemungkinan palsu yang dijana AI. Papan pemuka web semasa turut menyediakan pemantauan masa nyata, paparan Active, En Route dan Solved, penunjuk laporan belum dibuka, peta langsung, analitik dengan pilihan tempoh dan eksport CSV, pengurusan organisasi dan pentadbir, pengesahan laporan, serta bunyi amaran pelayar yang boleh dikonfigurasi. Sistem ini disemak melalui kes ujian fungsian, integrasi, keselamatan, prestasi, dan kebolehgunaan, dengan keputusan serta batasan direkodkan dalam Bab 6.</w:t>
       </w:r>
     </w:p>
     <w:p>
@@ -3729,7 +3729,7 @@
           <w:sz w:val="24"/>
           <w:szCs w:val="24"/>
         </w:rPr>
-        <w:t xml:space="preserve">Platform Coverage: The mobile application is developed using the Flutter framework, targeting Android devices as the primary deployment platform. The web dashboard is a browser-based application accessible to emergency organization administrators and operators.</w:t>
+        <w:t xml:space="preserve">Platform Coverage: The mobile application is developed using Flutter, with Android as the primary target. The organization and administrator portal is a browser-based HTML, CSS, and JavaScript application using Firebase web SDKs, MapLibre, Chart.js, and Firestore real-time listeners.</w:t>
       </w:r>
     </w:p>
     <w:p>
@@ -3805,7 +3805,7 @@
           <w:sz w:val="24"/>
           <w:szCs w:val="24"/>
         </w:rPr>
-        <w:t xml:space="preserve">FYP 1 Scope: This submission covers the core system including authentication, report submission, media upload, MinIO integration, Firestore integration, AI analysis, community alerts, and the organization web dashboard.</w:t>
+        <w:t xml:space="preserve">Current Scope: The implemented scope includes authentication and role-based access, report submission, media upload, MinIO integration, Firestore integration, asynchronous AI analysis, community alerts, organization report management, live map monitoring, analytics, report verification, organization management, unread indicators, and browser alert sound controls.</w:t>
       </w:r>
     </w:p>
     <w:p>
@@ -4018,7 +4018,7 @@
           <w:sz w:val="24"/>
           <w:szCs w:val="24"/>
         </w:rPr>
-        <w:t xml:space="preserve">A Spring Boot backend API service deployed on a cloud virtual private server (VPS) that handles authentication, media upload orchestration, AI enrichment coordination, geolocation routing, and push notification dispatch.</w:t>
+        <w:t xml:space="preserve">A Spring Boot backend API service that can be run locally or deployed to a configured server, handling authentication, media upload orchestration, AI enrichment coordination, geolocation routing, and push notification dispatch.</w:t>
       </w:r>
     </w:p>
     <w:p>
@@ -5276,7 +5276,7 @@
           <w:sz w:val="24"/>
           <w:szCs w:val="24"/>
         </w:rPr>
-        <w:t xml:space="preserve">Domain and SSL Certificate — For HTTPS deployment of the backend API (api.mybahaya.com)</w:t>
+        <w:t xml:space="preserve">Web Push VAPID Key — Required only when background browser push notifications are enabled for organization dashboards; the current source records this as a deployment prerequisite.</w:t>
       </w:r>
     </w:p>
     <w:p>
@@ -7974,21 +7974,6 @@
     </w:p>
     <w:p>
       <w:pPr>
-        <w:spacing w:after="160" w:before="0" w:line="360" w:lineRule="auto"/>
-        <w:jc w:val="both"/>
-      </w:pPr>
-      <w:r>
-        <w:rPr>
-          <w:rFonts w:ascii="Times New Roman" w:cs="Times New Roman" w:eastAsia="Times New Roman" w:hAnsi="Times New Roman"/>
-          <w:color w:val="000000"/>
-          <w:sz w:val="24"/>
-          <w:szCs w:val="24"/>
-        </w:rPr>
-        <w:t xml:space="preserve">System Administrator:</w:t>
-      </w:r>
-    </w:p>
-    <w:p>
-      <w:pPr>
         <w:pStyle w:val="ListParagraph"/>
         <w:numPr>
           <w:ilvl w:val="0"/>
@@ -8003,7 +7988,7 @@
           <w:sz w:val="24"/>
           <w:szCs w:val="24"/>
         </w:rPr>
-        <w:t xml:space="preserve">FR-A1: Administrators shall be able to manage user accounts and organization profiles.</w:t>
+        <w:t xml:space="preserve">FR-O7: Authorized dashboard users shall be able to filter reports by Malaysian scope or state, category, workflow stage, and date order.</w:t>
       </w:r>
     </w:p>
     <w:p>
@@ -8022,7 +8007,7 @@
           <w:sz w:val="24"/>
           <w:szCs w:val="24"/>
         </w:rPr>
-        <w:t xml:space="preserve">FR-A2: Administrators shall be able to view all reports across all organizations.</w:t>
+        <w:t xml:space="preserve">FR-O8: The dashboard shall provide a live incident map with category filters, grouped markers, counts, and recent activity.</w:t>
       </w:r>
     </w:p>
     <w:p>
@@ -8041,32 +8026,7 @@
           <w:sz w:val="24"/>
           <w:szCs w:val="24"/>
         </w:rPr>
-        <w:t xml:space="preserve">FR-A3: Administrators shall be able to verify, reject, or moderate reports.</w:t>
-      </w:r>
-    </w:p>
-    <w:p>
-      <w:pPr>
-        <w:spacing w:after="120" w:before="0"/>
-      </w:pPr>
-      <w:r>
-        <w:t xml:space="preserve"/>
-      </w:r>
-    </w:p>
-    <w:p>
-      <w:pPr>
-        <w:pStyle w:val="Heading3"/>
-        <w:spacing w:after="120" w:before="240"/>
-      </w:pPr>
-      <w:r>
-        <w:rPr>
-          <w:rFonts w:ascii="Times New Roman" w:cs="Times New Roman" w:eastAsia="Times New Roman" w:hAnsi="Times New Roman"/>
-          <w:b/>
-          <w:bCs/>
-          <w:color w:val="000000"/>
-          <w:sz w:val="24"/>
-          <w:szCs w:val="24"/>
-        </w:rPr>
-        <w:t xml:space="preserve">3.3.3     Non-Functional Requirement</w:t>
+        <w:t xml:space="preserve">FR-O9: The dashboard shall provide analytics for selected timeframes, including daily trends, hourly patterns, category distribution, day-of-week patterns, and CSV export.</w:t>
       </w:r>
     </w:p>
     <w:p>
@@ -8085,7 +8045,22 @@
           <w:sz w:val="24"/>
           <w:szCs w:val="24"/>
         </w:rPr>
-        <w:t xml:space="preserve">Performance: The report submission endpoint shall return a response within 3 seconds under normal network conditions. AI enrichment is processed asynchronously and shall complete within 30 seconds of submission.</w:t>
+        <w:t xml:space="preserve">FR-O10: The dashboard shall provide unread-report indicators, mark-opened controls, media preview, report verification, and status transition controls.</w:t>
+      </w:r>
+    </w:p>
+    <w:p>
+      <w:pPr>
+        <w:spacing w:after="160" w:before="0" w:line="360" w:lineRule="auto"/>
+        <w:jc w:val="both"/>
+      </w:pPr>
+      <w:r>
+        <w:rPr>
+          <w:rFonts w:ascii="Times New Roman" w:cs="Times New Roman" w:eastAsia="Times New Roman" w:hAnsi="Times New Roman"/>
+          <w:color w:val="000000"/>
+          <w:sz w:val="24"/>
+          <w:szCs w:val="24"/>
+        </w:rPr>
+        <w:t xml:space="preserve">System Administrator:</w:t>
       </w:r>
     </w:p>
     <w:p>
@@ -8104,7 +8079,7 @@
           <w:sz w:val="24"/>
           <w:szCs w:val="24"/>
         </w:rPr>
-        <w:t xml:space="preserve">Reliability: The system shall utilize Firebase Firestore's built-in redundancy to ensure 99.9% uptime for data persistence operations.</w:t>
+        <w:t xml:space="preserve">FR-A1: Administrators shall be able to manage user accounts and organization profiles.</w:t>
       </w:r>
     </w:p>
     <w:p>
@@ -8123,7 +8098,7 @@
           <w:sz w:val="24"/>
           <w:szCs w:val="24"/>
         </w:rPr>
-        <w:t xml:space="preserve">Security: All API endpoints shall require Firebase JWT authentication. Media files shall be stored in a private MinIO bucket accessible only through the backend API. The Gemini API key shall never be exposed on the client side.</w:t>
+        <w:t xml:space="preserve">FR-A2: Administrators shall be able to view all reports across all organizations.</w:t>
       </w:r>
     </w:p>
     <w:p>
@@ -8142,7 +8117,32 @@
           <w:sz w:val="24"/>
           <w:szCs w:val="24"/>
         </w:rPr>
-        <w:t xml:space="preserve">Scalability: The backend API shall be deployable on a VPS with horizontal scaling capability via container orchestration. Firebase Firestore automatically scales to accommodate growing data volumes.</w:t>
+        <w:t xml:space="preserve">FR-A3: Administrators shall be able to verify, reject, or moderate reports.</w:t>
+      </w:r>
+    </w:p>
+    <w:p>
+      <w:pPr>
+        <w:spacing w:after="120" w:before="0"/>
+      </w:pPr>
+      <w:r>
+        <w:t xml:space="preserve"/>
+      </w:r>
+    </w:p>
+    <w:p>
+      <w:pPr>
+        <w:pStyle w:val="Heading3"/>
+        <w:spacing w:after="120" w:before="240"/>
+      </w:pPr>
+      <w:r>
+        <w:rPr>
+          <w:rFonts w:ascii="Times New Roman" w:cs="Times New Roman" w:eastAsia="Times New Roman" w:hAnsi="Times New Roman"/>
+          <w:b/>
+          <w:bCs/>
+          <w:color w:val="000000"/>
+          <w:sz w:val="24"/>
+          <w:szCs w:val="24"/>
+        </w:rPr>
+        <w:t xml:space="preserve">3.3.3     Non-Functional Requirement</w:t>
       </w:r>
     </w:p>
     <w:p>
@@ -8161,7 +8161,7 @@
           <w:sz w:val="24"/>
           <w:szCs w:val="24"/>
         </w:rPr>
-        <w:t xml:space="preserve">Usability: The mobile application shall allow a citizen to submit a complete emergency report within 60 seconds from opening the app to submission confirmation.</w:t>
+        <w:t xml:space="preserve">Performance: The report submission endpoint shall return a response within 3 seconds under normal network conditions. AI enrichment is processed asynchronously and shall complete within 30 seconds of submission.</w:t>
       </w:r>
     </w:p>
     <w:p>
@@ -8180,32 +8180,7 @@
           <w:sz w:val="24"/>
           <w:szCs w:val="24"/>
         </w:rPr>
-        <w:t xml:space="preserve">Accuracy: The AI severity classification shall achieve at least 80% agreement with human assessors on a test dataset of 50 labeled incident images.</w:t>
-      </w:r>
-    </w:p>
-    <w:p>
-      <w:pPr>
-        <w:spacing w:after="120" w:before="0"/>
-      </w:pPr>
-      <w:r>
-        <w:t xml:space="preserve"/>
-      </w:r>
-    </w:p>
-    <w:p>
-      <w:pPr>
-        <w:pStyle w:val="Heading3"/>
-        <w:spacing w:after="120" w:before="240"/>
-      </w:pPr>
-      <w:r>
-        <w:rPr>
-          <w:rFonts w:ascii="Times New Roman" w:cs="Times New Roman" w:eastAsia="Times New Roman" w:hAnsi="Times New Roman"/>
-          <w:b/>
-          <w:bCs/>
-          <w:color w:val="000000"/>
-          <w:sz w:val="24"/>
-          <w:szCs w:val="24"/>
-        </w:rPr>
-        <w:t xml:space="preserve">3.3.4     Others Requirement</w:t>
+        <w:t xml:space="preserve">Reliability: The system shall utilize Firebase Firestore's built-in redundancy to ensure 99.9% uptime for data persistence operations.</w:t>
       </w:r>
     </w:p>
     <w:p>
@@ -8224,7 +8199,7 @@
           <w:sz w:val="24"/>
           <w:szCs w:val="24"/>
         </w:rPr>
-        <w:t xml:space="preserve">Firebase Project Configuration: A configured Firebase project with Firestore, Authentication, and Cloud Messaging enabled is required for system operation.</w:t>
+        <w:t xml:space="preserve">Security: All API endpoints shall require Firebase JWT authentication. Media files shall be stored in a private MinIO bucket accessible only through the backend API. The Gemini API key shall never be exposed on the client side.</w:t>
       </w:r>
     </w:p>
     <w:p>
@@ -8243,7 +8218,7 @@
           <w:sz w:val="24"/>
           <w:szCs w:val="24"/>
         </w:rPr>
-        <w:t xml:space="preserve">Internet Connectivity: The mobile application requires an active internet connection for report submission and alert reception. Offline mode is not supported in the current scope.</w:t>
+        <w:t xml:space="preserve">Scalability: The backend API shall be deployable on a VPS with horizontal scaling capability via container orchestration. Firebase Firestore automatically scales to accommodate growing data volumes.</w:t>
       </w:r>
     </w:p>
     <w:p>
@@ -8262,7 +8237,7 @@
           <w:sz w:val="24"/>
           <w:szCs w:val="24"/>
         </w:rPr>
-        <w:t xml:space="preserve">Android Permissions: The mobile application requires Android permissions for camera access, location services, and storage read/write.</w:t>
+        <w:t xml:space="preserve">Usability: The mobile application shall allow a citizen to submit a complete emergency report within 60 seconds from opening the app to submission confirmation.</w:t>
       </w:r>
     </w:p>
     <w:p>
@@ -8281,7 +8256,7 @@
           <w:sz w:val="24"/>
           <w:szCs w:val="24"/>
         </w:rPr>
-        <w:t xml:space="preserve">VPS Deployment: A Linux VPS with Docker installed is required for MinIO deployment. The Spring Boot backend is deployed as a standalone JAR via a systemd service.</w:t>
+        <w:t xml:space="preserve">Accuracy: The AI severity classification shall achieve at least 80% agreement with human assessors on a test dataset of 50 labeled incident images.</w:t>
       </w:r>
     </w:p>
     <w:p>
@@ -8294,8 +8269,8 @@
     </w:p>
     <w:p>
       <w:pPr>
-        <w:pStyle w:val="Heading2"/>
-        <w:spacing w:after="120" w:before="360"/>
+        <w:pStyle w:val="Heading3"/>
+        <w:spacing w:after="120" w:before="240"/>
       </w:pPr>
       <w:r>
         <w:rPr>
@@ -8303,145 +8278,10 @@
           <w:b/>
           <w:bCs/>
           <w:color w:val="000000"/>
-          <w:sz w:val="26"/>
-          <w:szCs w:val="26"/>
-        </w:rPr>
-        <w:t xml:space="preserve">3.4     Conclusion</w:t>
-      </w:r>
-    </w:p>
-    <w:p>
-      <w:pPr>
-        <w:spacing w:after="160" w:before="0" w:line="360" w:lineRule="auto"/>
-        <w:jc w:val="both"/>
-      </w:pPr>
-      <w:r>
-        <w:rPr>
-          <w:rFonts w:ascii="Times New Roman" w:cs="Times New Roman" w:eastAsia="Times New Roman" w:hAnsi="Times New Roman"/>
-          <w:color w:val="000000"/>
-          <w:sz w:val="24"/>
-          <w:szCs w:val="24"/>
-        </w:rPr>
-        <w:t xml:space="preserve">This chapter presented a comprehensive analysis of the MyBahaya system, identifying the shortcomings of the current emergency reporting process in Malaysia and defining the functional, data, non-functional, and other requirements that the system must satisfy. The analysis establishes a clear specification against which the design and implementation chapters will be validated. Chapter 4 will translate these requirements into concrete system design artifacts.</w:t>
-      </w:r>
-    </w:p>
-    <w:p>
-      <w:r>
-        <w:br w:type="page"/>
-      </w:r>
-    </w:p>
-    <w:p>
-      <w:pPr>
-        <w:pStyle w:val="Heading1"/>
-        <w:spacing w:after="240" w:before="480"/>
-        <w:jc w:val="center"/>
-      </w:pPr>
-      <w:r>
-        <w:rPr>
-          <w:rFonts w:ascii="Times New Roman" w:cs="Times New Roman" w:eastAsia="Times New Roman" w:hAnsi="Times New Roman"/>
-          <w:b/>
-          <w:bCs/>
-          <w:color w:val="000000"/>
-          <w:sz w:val="32"/>
-          <w:szCs w:val="32"/>
-        </w:rPr>
-        <w:t xml:space="preserve">CHAPTER 4.          DESIGN</w:t>
-      </w:r>
-    </w:p>
-    <w:p>
-      <w:pPr>
-        <w:spacing w:after="120" w:before="0"/>
-      </w:pPr>
-      <w:r>
-        <w:t xml:space="preserve"/>
-      </w:r>
-    </w:p>
-    <w:p>
-      <w:pPr>
-        <w:pStyle w:val="Heading2"/>
-        <w:spacing w:after="120" w:before="360"/>
-      </w:pPr>
-      <w:r>
-        <w:rPr>
-          <w:rFonts w:ascii="Times New Roman" w:cs="Times New Roman" w:eastAsia="Times New Roman" w:hAnsi="Times New Roman"/>
-          <w:b/>
-          <w:bCs/>
-          <w:color w:val="000000"/>
-          <w:sz w:val="26"/>
-          <w:szCs w:val="26"/>
-        </w:rPr>
-        <w:t xml:space="preserve">4.1     Introduction</w:t>
-      </w:r>
-    </w:p>
-    <w:p>
-      <w:pPr>
-        <w:spacing w:after="160" w:before="0" w:line="360" w:lineRule="auto"/>
-        <w:jc w:val="both"/>
-      </w:pPr>
-      <w:r>
-        <w:rPr>
-          <w:rFonts w:ascii="Times New Roman" w:cs="Times New Roman" w:eastAsia="Times New Roman" w:hAnsi="Times New Roman"/>
-          <w:color w:val="000000"/>
-          <w:sz w:val="24"/>
-          <w:szCs w:val="24"/>
-        </w:rPr>
-        <w:t xml:space="preserve">This chapter defines the high-level and detailed design of the MyBahaya system. It covers the system architecture, user interface design for both the mobile application and web dashboard, database design, and the detailed software design for key system modules. The designs presented here are the result of translating the requirements identified in Chapter 3 into concrete structural and behavioral specifications.</w:t>
-      </w:r>
-    </w:p>
-    <w:p>
-      <w:pPr>
-        <w:spacing w:after="120" w:before="0"/>
-      </w:pPr>
-      <w:r>
-        <w:t xml:space="preserve"/>
-      </w:r>
-    </w:p>
-    <w:p>
-      <w:pPr>
-        <w:pStyle w:val="Heading2"/>
-        <w:spacing w:after="120" w:before="360"/>
-      </w:pPr>
-      <w:r>
-        <w:rPr>
-          <w:rFonts w:ascii="Times New Roman" w:cs="Times New Roman" w:eastAsia="Times New Roman" w:hAnsi="Times New Roman"/>
-          <w:b/>
-          <w:bCs/>
-          <w:color w:val="000000"/>
-          <w:sz w:val="26"/>
-          <w:szCs w:val="26"/>
-        </w:rPr>
-        <w:t xml:space="preserve">4.2     High-Level Design</w:t>
-      </w:r>
-    </w:p>
-    <w:p>
-      <w:pPr>
-        <w:pStyle w:val="Heading3"/>
-        <w:spacing w:after="120" w:before="240"/>
-      </w:pPr>
-      <w:r>
-        <w:rPr>
-          <w:rFonts w:ascii="Times New Roman" w:cs="Times New Roman" w:eastAsia="Times New Roman" w:hAnsi="Times New Roman"/>
-          <w:b/>
-          <w:bCs/>
-          <w:color w:val="000000"/>
-          <w:sz w:val="24"/>
-          <w:szCs w:val="24"/>
-        </w:rPr>
-        <w:t xml:space="preserve">4.2.1     System Architecture</w:t>
-      </w:r>
-    </w:p>
-    <w:p>
-      <w:pPr>
-        <w:spacing w:after="160" w:before="0" w:line="360" w:lineRule="auto"/>
-        <w:jc w:val="both"/>
-      </w:pPr>
-      <w:r>
-        <w:rPr>
-          <w:rFonts w:ascii="Times New Roman" w:cs="Times New Roman" w:eastAsia="Times New Roman" w:hAnsi="Times New Roman"/>
-          <w:color w:val="000000"/>
-          <w:sz w:val="24"/>
-          <w:szCs w:val="24"/>
-        </w:rPr>
-        <w:t xml:space="preserve">MyBahaya follows a multi-tier client-server architecture with the following layers:</w:t>
+          <w:sz w:val="24"/>
+          <w:szCs w:val="24"/>
+        </w:rPr>
+        <w:t xml:space="preserve">3.3.4     Others Requirement</w:t>
       </w:r>
     </w:p>
     <w:p>
@@ -8460,7 +8300,7 @@
           <w:sz w:val="24"/>
           <w:szCs w:val="24"/>
         </w:rPr>
-        <w:t xml:space="preserve">Presentation Layer: Flutter-based Android mobile application (Citizen) and HTML/CSS/JavaScript web dashboard (Emergency Organization).</w:t>
+        <w:t xml:space="preserve">Firebase Project Configuration: A configured Firebase project with Firestore, Authentication, and Cloud Messaging enabled is required for system operation.</w:t>
       </w:r>
     </w:p>
     <w:p>
@@ -8479,7 +8319,243 @@
           <w:sz w:val="24"/>
           <w:szCs w:val="24"/>
         </w:rPr>
-        <w:t xml:space="preserve">Application Layer: Spring Boot REST API deployed on a Linux VPS. Handles authentication validation, business logic, media orchestration, AI enrichment dispatch, geolocation routing, and FCM notifications.</w:t>
+        <w:t xml:space="preserve">Internet Connectivity: The mobile application requires an active internet connection for report submission and alert reception. Offline mode is not supported in the current scope.</w:t>
+      </w:r>
+    </w:p>
+    <w:p>
+      <w:pPr>
+        <w:pStyle w:val="ListParagraph"/>
+        <w:numPr>
+          <w:ilvl w:val="0"/>
+          <w:numId w:val="3"/>
+        </w:numPr>
+        <w:spacing w:after="120" w:before="0" w:line="360" w:lineRule="auto"/>
+      </w:pPr>
+      <w:r>
+        <w:rPr>
+          <w:rFonts w:ascii="Times New Roman" w:cs="Times New Roman" w:eastAsia="Times New Roman" w:hAnsi="Times New Roman"/>
+          <w:color w:val="000000"/>
+          <w:sz w:val="24"/>
+          <w:szCs w:val="24"/>
+        </w:rPr>
+        <w:t xml:space="preserve">Android Permissions: The mobile application requires Android permissions for camera access, location services, and storage read/write.</w:t>
+      </w:r>
+    </w:p>
+    <w:p>
+      <w:pPr>
+        <w:pStyle w:val="ListParagraph"/>
+        <w:numPr>
+          <w:ilvl w:val="0"/>
+          <w:numId w:val="3"/>
+        </w:numPr>
+        <w:spacing w:after="120" w:before="0" w:line="360" w:lineRule="auto"/>
+      </w:pPr>
+      <w:r>
+        <w:rPr>
+          <w:rFonts w:ascii="Times New Roman" w:cs="Times New Roman" w:eastAsia="Times New Roman" w:hAnsi="Times New Roman"/>
+          <w:color w:val="000000"/>
+          <w:sz w:val="24"/>
+          <w:szCs w:val="24"/>
+        </w:rPr>
+        <w:t xml:space="preserve">Service Deployment: A local Docker/Compose environment or configured server is required for MinIO and the Spring Boot backend; the repository includes deployment configuration for these services.</w:t>
+      </w:r>
+    </w:p>
+    <w:p>
+      <w:pPr>
+        <w:spacing w:after="120" w:before="0"/>
+      </w:pPr>
+      <w:r>
+        <w:t xml:space="preserve"/>
+      </w:r>
+    </w:p>
+    <w:p>
+      <w:pPr>
+        <w:pStyle w:val="Heading2"/>
+        <w:spacing w:after="120" w:before="360"/>
+      </w:pPr>
+      <w:r>
+        <w:rPr>
+          <w:rFonts w:ascii="Times New Roman" w:cs="Times New Roman" w:eastAsia="Times New Roman" w:hAnsi="Times New Roman"/>
+          <w:b/>
+          <w:bCs/>
+          <w:color w:val="000000"/>
+          <w:sz w:val="26"/>
+          <w:szCs w:val="26"/>
+        </w:rPr>
+        <w:t xml:space="preserve">3.4     Conclusion</w:t>
+      </w:r>
+    </w:p>
+    <w:p>
+      <w:pPr>
+        <w:spacing w:after="160" w:before="0" w:line="360" w:lineRule="auto"/>
+        <w:jc w:val="both"/>
+      </w:pPr>
+      <w:r>
+        <w:rPr>
+          <w:rFonts w:ascii="Times New Roman" w:cs="Times New Roman" w:eastAsia="Times New Roman" w:hAnsi="Times New Roman"/>
+          <w:color w:val="000000"/>
+          <w:sz w:val="24"/>
+          <w:szCs w:val="24"/>
+        </w:rPr>
+        <w:t xml:space="preserve">This chapter presented a comprehensive analysis of the MyBahaya system, identifying the shortcomings of the current emergency reporting process in Malaysia and defining the functional, data, non-functional, and other requirements that the system must satisfy. The analysis establishes a clear specification against which the design and implementation chapters will be validated. Chapter 4 will translate these requirements into concrete system design artifacts.</w:t>
+      </w:r>
+    </w:p>
+    <w:p>
+      <w:r>
+        <w:br w:type="page"/>
+      </w:r>
+    </w:p>
+    <w:p>
+      <w:pPr>
+        <w:pStyle w:val="Heading1"/>
+        <w:spacing w:after="240" w:before="480"/>
+        <w:jc w:val="center"/>
+      </w:pPr>
+      <w:r>
+        <w:rPr>
+          <w:rFonts w:ascii="Times New Roman" w:cs="Times New Roman" w:eastAsia="Times New Roman" w:hAnsi="Times New Roman"/>
+          <w:b/>
+          <w:bCs/>
+          <w:color w:val="000000"/>
+          <w:sz w:val="32"/>
+          <w:szCs w:val="32"/>
+        </w:rPr>
+        <w:t xml:space="preserve">CHAPTER 4.          DESIGN</w:t>
+      </w:r>
+    </w:p>
+    <w:p>
+      <w:pPr>
+        <w:spacing w:after="120" w:before="0"/>
+      </w:pPr>
+      <w:r>
+        <w:t xml:space="preserve"/>
+      </w:r>
+    </w:p>
+    <w:p>
+      <w:pPr>
+        <w:pStyle w:val="Heading2"/>
+        <w:spacing w:after="120" w:before="360"/>
+      </w:pPr>
+      <w:r>
+        <w:rPr>
+          <w:rFonts w:ascii="Times New Roman" w:cs="Times New Roman" w:eastAsia="Times New Roman" w:hAnsi="Times New Roman"/>
+          <w:b/>
+          <w:bCs/>
+          <w:color w:val="000000"/>
+          <w:sz w:val="26"/>
+          <w:szCs w:val="26"/>
+        </w:rPr>
+        <w:t xml:space="preserve">4.1     Introduction</w:t>
+      </w:r>
+    </w:p>
+    <w:p>
+      <w:pPr>
+        <w:spacing w:after="160" w:before="0" w:line="360" w:lineRule="auto"/>
+        <w:jc w:val="both"/>
+      </w:pPr>
+      <w:r>
+        <w:rPr>
+          <w:rFonts w:ascii="Times New Roman" w:cs="Times New Roman" w:eastAsia="Times New Roman" w:hAnsi="Times New Roman"/>
+          <w:color w:val="000000"/>
+          <w:sz w:val="24"/>
+          <w:szCs w:val="24"/>
+        </w:rPr>
+        <w:t xml:space="preserve">This chapter defines the high-level and detailed design of the MyBahaya system. It covers the system architecture, user interface design for both the mobile application and web dashboard, database design, and the detailed software design for key system modules. The designs presented here are the result of translating the requirements identified in Chapter 3 into concrete structural and behavioral specifications.</w:t>
+      </w:r>
+    </w:p>
+    <w:p>
+      <w:pPr>
+        <w:spacing w:after="120" w:before="0"/>
+      </w:pPr>
+      <w:r>
+        <w:t xml:space="preserve"/>
+      </w:r>
+    </w:p>
+    <w:p>
+      <w:pPr>
+        <w:pStyle w:val="Heading2"/>
+        <w:spacing w:after="120" w:before="360"/>
+      </w:pPr>
+      <w:r>
+        <w:rPr>
+          <w:rFonts w:ascii="Times New Roman" w:cs="Times New Roman" w:eastAsia="Times New Roman" w:hAnsi="Times New Roman"/>
+          <w:b/>
+          <w:bCs/>
+          <w:color w:val="000000"/>
+          <w:sz w:val="26"/>
+          <w:szCs w:val="26"/>
+        </w:rPr>
+        <w:t xml:space="preserve">4.2     High-Level Design</w:t>
+      </w:r>
+    </w:p>
+    <w:p>
+      <w:pPr>
+        <w:pStyle w:val="Heading3"/>
+        <w:spacing w:after="120" w:before="240"/>
+      </w:pPr>
+      <w:r>
+        <w:rPr>
+          <w:rFonts w:ascii="Times New Roman" w:cs="Times New Roman" w:eastAsia="Times New Roman" w:hAnsi="Times New Roman"/>
+          <w:b/>
+          <w:bCs/>
+          <w:color w:val="000000"/>
+          <w:sz w:val="24"/>
+          <w:szCs w:val="24"/>
+        </w:rPr>
+        <w:t xml:space="preserve">4.2.1     System Architecture</w:t>
+      </w:r>
+    </w:p>
+    <w:p>
+      <w:pPr>
+        <w:spacing w:after="160" w:before="0" w:line="360" w:lineRule="auto"/>
+        <w:jc w:val="both"/>
+      </w:pPr>
+      <w:r>
+        <w:rPr>
+          <w:rFonts w:ascii="Times New Roman" w:cs="Times New Roman" w:eastAsia="Times New Roman" w:hAnsi="Times New Roman"/>
+          <w:color w:val="000000"/>
+          <w:sz w:val="24"/>
+          <w:szCs w:val="24"/>
+        </w:rPr>
+        <w:t xml:space="preserve">MyBahaya follows a multi-tier client-server architecture with the following layers:</w:t>
+      </w:r>
+    </w:p>
+    <w:p>
+      <w:pPr>
+        <w:pStyle w:val="ListParagraph"/>
+        <w:numPr>
+          <w:ilvl w:val="0"/>
+          <w:numId w:val="3"/>
+        </w:numPr>
+        <w:spacing w:after="120" w:before="0" w:line="360" w:lineRule="auto"/>
+      </w:pPr>
+      <w:r>
+        <w:rPr>
+          <w:rFonts w:ascii="Times New Roman" w:cs="Times New Roman" w:eastAsia="Times New Roman" w:hAnsi="Times New Roman"/>
+          <w:color w:val="000000"/>
+          <w:sz w:val="24"/>
+          <w:szCs w:val="24"/>
+        </w:rPr>
+        <w:t xml:space="preserve">Presentation Layer: Flutter-based Android mobile application (Citizen) and HTML/CSS/JavaScript web dashboard (Emergency Organization).</w:t>
+      </w:r>
+    </w:p>
+    <w:p>
+      <w:pPr>
+        <w:pStyle w:val="ListParagraph"/>
+        <w:numPr>
+          <w:ilvl w:val="0"/>
+          <w:numId w:val="3"/>
+        </w:numPr>
+        <w:spacing w:after="120" w:before="0" w:line="360" w:lineRule="auto"/>
+      </w:pPr>
+      <w:r>
+        <w:rPr>
+          <w:rFonts w:ascii="Times New Roman" w:cs="Times New Roman" w:eastAsia="Times New Roman" w:hAnsi="Times New Roman"/>
+          <w:color w:val="000000"/>
+          <w:sz w:val="24"/>
+          <w:szCs w:val="24"/>
+        </w:rPr>
+        <w:t xml:space="preserve">Application Layer: Spring Boot REST API run through the configured local or server environment. It handles authentication validation, business logic, media orchestration, AI enrichment dispatch, geolocation routing, and FCM notifications.</w:t>
       </w:r>
     </w:p>
     <w:p>
@@ -8718,7 +8794,7 @@
           <w:sz w:val="24"/>
           <w:szCs w:val="24"/>
         </w:rPr>
-        <w:t xml:space="preserve">The web dashboard uses a sidebar navigation layout with the following sections: Dashboard Overview, Reports Management, Map View, Analytics, Organization Profile, and Administration (admin role only).</w:t>
+        <w:t xml:space="preserve">The web dashboard uses a sidebar navigation layout with Dashboard, Reports, Map, Analytics, and an administrator-only Organizations section. The Reports page groups the workflow into Active, Marked as En Route, and Solved views, and supports search, Malaysia/state scope, category filters, sorting, unread indicators, and a Mark All Opened action. The dashboard also includes a settings menu with account information, logout, alert-sound preferences, and a test real-time alert action.</w:t>
       </w:r>
     </w:p>
     <w:p>
@@ -16915,7 +16991,7 @@
           <w:sz w:val="24"/>
           <w:szCs w:val="24"/>
         </w:rPr>
-        <w:t xml:space="preserve">The MyBahaya system is deployed across two environments: the development environment on the developer's local machine, and the production environment on a cloud-based VPS.</w:t>
+        <w:t xml:space="preserve">The current repository is operated in a local development environment. The web portal is served as static files, while the Spring Boot backend and MinIO services can be started locally using the provided deployment and compose configuration. Firebase remains the managed authentication, Firestore, and messaging service used by the application.</w:t>
       </w:r>
     </w:p>
     <w:p>
@@ -17086,7 +17162,7 @@
           <w:sz w:val="24"/>
           <w:szCs w:val="24"/>
         </w:rPr>
-        <w:t xml:space="preserve">Production Environment:</w:t>
+        <w:t xml:space="preserve">Local Service Configuration:</w:t>
       </w:r>
     </w:p>
     <w:p>
@@ -17105,7 +17181,7 @@
           <w:sz w:val="24"/>
           <w:szCs w:val="24"/>
         </w:rPr>
-        <w:t xml:space="preserve">VPS: Linux Ubuntu 22.04 LTS, 4 vCPU, 8GB RAM</w:t>
+        <w:t xml:space="preserve">Spring Boot backend: Java 21 application built with Maven and exposed through the configured local API base URL.</w:t>
       </w:r>
     </w:p>
     <w:p>
@@ -17124,7 +17200,7 @@
           <w:sz w:val="24"/>
           <w:szCs w:val="24"/>
         </w:rPr>
-        <w:t xml:space="preserve">Domain: api.mybahaya.com with SSL/TLS certificate via Let's Encrypt</w:t>
+        <w:t xml:space="preserve">MinIO: Docker/Compose service used for report images and optional videos, with media URLs stored in Firestore.</w:t>
       </w:r>
     </w:p>
     <w:p>
@@ -17143,45 +17219,7 @@
           <w:sz w:val="24"/>
           <w:szCs w:val="24"/>
         </w:rPr>
-        <w:t xml:space="preserve">Spring Boot API: Deployed as a standalone JAR managed by systemd on port 8080</w:t>
-      </w:r>
-    </w:p>
-    <w:p>
-      <w:pPr>
-        <w:pStyle w:val="ListParagraph"/>
-        <w:numPr>
-          <w:ilvl w:val="0"/>
-          <w:numId w:val="3"/>
-        </w:numPr>
-        <w:spacing w:after="120" w:before="0" w:line="360" w:lineRule="auto"/>
-      </w:pPr>
-      <w:r>
-        <w:rPr>
-          <w:rFonts w:ascii="Times New Roman" w:cs="Times New Roman" w:eastAsia="Times New Roman" w:hAnsi="Times New Roman"/>
-          <w:color w:val="000000"/>
-          <w:sz w:val="24"/>
-          <w:szCs w:val="24"/>
-        </w:rPr>
-        <w:t xml:space="preserve">MinIO: Docker container on port 9000, persisted to local volume</w:t>
-      </w:r>
-    </w:p>
-    <w:p>
-      <w:pPr>
-        <w:pStyle w:val="ListParagraph"/>
-        <w:numPr>
-          <w:ilvl w:val="0"/>
-          <w:numId w:val="3"/>
-        </w:numPr>
-        <w:spacing w:after="120" w:before="0" w:line="360" w:lineRule="auto"/>
-      </w:pPr>
-      <w:r>
-        <w:rPr>
-          <w:rFonts w:ascii="Times New Roman" w:cs="Times New Roman" w:eastAsia="Times New Roman" w:hAnsi="Times New Roman"/>
-          <w:color w:val="000000"/>
-          <w:sz w:val="24"/>
-          <w:szCs w:val="24"/>
-        </w:rPr>
-        <w:t xml:space="preserve">Nginx: Reverse proxy routing api.mybahaya.com to the Spring Boot service and /minio/* to MinIO</w:t>
+        <w:t xml:space="preserve">Web dashboard: Static HTML pages with CSS and JavaScript modules, Firebase Authentication, Firestore listeners, MapLibre, Chart.js, and browser service-worker support.</w:t>
       </w:r>
     </w:p>
     <w:p>
@@ -17204,7 +17242,7 @@
           <w:sz w:val="24"/>
           <w:szCs w:val="24"/>
         </w:rPr>
-        <w:t xml:space="preserve">The production deployment topology is illustrated in Figure 5.1.</w:t>
+        <w:t xml:space="preserve">The intended service deployment topology is illustrated in Figure 5.1.</w:t>
       </w:r>
     </w:p>
     <w:tbl>
@@ -17477,7 +17515,7 @@
           <w:sz w:val="24"/>
           <w:szCs w:val="24"/>
         </w:rPr>
-        <w:t xml:space="preserve">main branch: Contains production-ready, deployed code. Direct commits to main are not permitted; merges are performed via pull requests from feature branches.</w:t>
+        <w:t xml:space="preserve">The latest repository history records incremental fixes to the web portal, including report grouping into Active, En Route, and Solved, unread-report indicators, alert sounds, login and visibility improvements, and map-page fixes.</w:t>
       </w:r>
     </w:p>
     <w:p>
@@ -17496,26 +17534,7 @@
           <w:sz w:val="24"/>
           <w:szCs w:val="24"/>
         </w:rPr>
-        <w:t xml:space="preserve">do-advance-ai branch (current): Development branch for AI integration and advanced features. This is the active development branch at the time of this report submission.</w:t>
-      </w:r>
-    </w:p>
-    <w:p>
-      <w:pPr>
-        <w:pStyle w:val="ListParagraph"/>
-        <w:numPr>
-          <w:ilvl w:val="0"/>
-          <w:numId w:val="3"/>
-        </w:numPr>
-        <w:spacing w:after="120" w:before="0" w:line="360" w:lineRule="auto"/>
-      </w:pPr>
-      <w:r>
-        <w:rPr>
-          <w:rFonts w:ascii="Times New Roman" w:cs="Times New Roman" w:eastAsia="Times New Roman" w:hAnsi="Times New Roman"/>
-          <w:color w:val="000000"/>
-          <w:sz w:val="24"/>
-          <w:szCs w:val="24"/>
-        </w:rPr>
-        <w:t xml:space="preserve">Feature branches: Individual features (e.g., feature/fcm-notifications, feature/web-analytics) are developed in separate branches and merged into the development branch upon completion and testing.</w:t>
+        <w:t xml:space="preserve">Changes are tracked in Git so that the mobile application, backend, web portal, diagrams, and report generator can be reviewed together.</w:t>
       </w:r>
     </w:p>
     <w:p>
@@ -17530,7 +17549,7 @@
           <w:sz w:val="24"/>
           <w:szCs w:val="24"/>
         </w:rPr>
-        <w:t xml:space="preserve">Commit messages follow a conventional format: {type}: {description}, where type is one of feat, fix, chore, docs, or refactor. Examples include 'feat: implement AI enrichment service with Gemini 2.5 Flash' and 'fix: resolve camera permission handling on Android 13'.</w:t>
+        <w:t xml:space="preserve">Configuration secrets are kept outside the source tree. The web portal uses public Firebase client configuration while Firestore rules and backend authentication provide access control. Browser push delivery additionally requires a valid Firebase Web Push VAPID key; the current source contains a placeholder and therefore this deployment prerequisite is recorded as a limitation rather than claimed as universally enabled.</w:t>
       </w:r>
     </w:p>
     <w:p>
@@ -19622,7 +19641,7 @@
                 <w:sz w:val="22"/>
                 <w:szCs w:val="22"/>
               </w:rPr>
-              <w:t xml:space="preserve">Real-time report list, clickable detail modal with AI analysis, status update controls</w:t>
+              <w:t xml:space="preserve">Real-time Firestore report list with Active, En Route, and Solved workflow views, scope/category/status filters, unread indicators, sorting, media modal, AI panel, verification, and status controls</w:t>
             </w:r>
           </w:p>
         </w:tc>
@@ -19760,7 +19779,7 @@
                 <w:sz w:val="22"/>
                 <w:szCs w:val="22"/>
               </w:rPr>
-              <w:t xml:space="preserve">Incident count summaries by category and status using Chart.js</w:t>
+              <w:t xml:space="preserve">Timeframe-aware KPI cards, daily/hourly/day-of-week charts, category distribution, recent reports, and CSV export using Chart.js</w:t>
             </w:r>
           </w:p>
         </w:tc>
@@ -19828,7 +19847,7 @@
                 <w:sz w:val="22"/>
                 <w:szCs w:val="22"/>
               </w:rPr>
-              <w:t xml:space="preserve">analytics.html</w:t>
+              <w:t xml:space="preserve">analytics.html, analytics.js</w:t>
             </w:r>
           </w:p>
         </w:tc>
@@ -19898,7 +19917,7 @@
                 <w:sz w:val="22"/>
                 <w:szCs w:val="22"/>
               </w:rPr>
-              <w:t xml:space="preserve">Leaflet.js map showing all incidents with clickable markers</w:t>
+              <w:t xml:space="preserve">MapLibre live map with grouped incident markers, category legend and filters, live counts, recent activity, zoom and locate controls</w:t>
             </w:r>
           </w:p>
         </w:tc>
@@ -19966,7 +19985,7 @@
                 <w:sz w:val="22"/>
                 <w:szCs w:val="22"/>
               </w:rPr>
-              <w:t xml:space="preserve">map.html</w:t>
+              <w:t xml:space="preserve">map.html, map.js</w:t>
             </w:r>
           </w:p>
         </w:tc>
@@ -20036,7 +20055,7 @@
                 <w:sz w:val="22"/>
                 <w:szCs w:val="22"/>
               </w:rPr>
-              <w:t xml:space="preserve">Admin management of organization profiles and assignments</w:t>
+              <w:t xml:space="preserve">Admin management of organizations and administrators with search, type/status filtering, and modal forms</w:t>
             </w:r>
           </w:p>
         </w:tc>
@@ -20104,7 +20123,145 @@
                 <w:sz w:val="22"/>
                 <w:szCs w:val="22"/>
               </w:rPr>
-              <w:t xml:space="preserve">organizations.html</w:t>
+              <w:t xml:space="preserve">organizations.html, organizations.js</w:t>
+            </w:r>
+          </w:p>
+        </w:tc>
+      </w:tr>
+      <w:tr>
+        <w:tc>
+          <w:tcPr>
+            <w:tcW w:type="dxa" w:w="2256"/>
+            <w:tcBorders>
+              <w:top w:val="single" w:color="999999" w:sz="4"/>
+              <w:left w:val="single" w:color="999999" w:sz="4"/>
+              <w:bottom w:val="single" w:color="999999" w:sz="4"/>
+              <w:right w:val="single" w:color="999999" w:sz="4"/>
+            </w:tcBorders>
+            <w:shd w:fill="FFFFFF" w:val="clear"/>
+            <w:tcMar>
+              <w:top w:type="dxa" w:w="80"/>
+              <w:left w:type="dxa" w:w="120"/>
+              <w:bottom w:type="dxa" w:w="80"/>
+              <w:right w:type="dxa" w:w="120"/>
+            </w:tcMar>
+          </w:tcPr>
+          <w:p>
+            <w:pPr>
+              <w:spacing w:after="0" w:before="0"/>
+            </w:pPr>
+            <w:r>
+              <w:rPr>
+                <w:rFonts w:ascii="Times New Roman" w:cs="Times New Roman" w:eastAsia="Times New Roman" w:hAnsi="Times New Roman"/>
+                <w:b w:val="false"/>
+                <w:bCs w:val="false"/>
+                <w:color w:val="000000"/>
+                <w:sz w:val="22"/>
+                <w:szCs w:val="22"/>
+              </w:rPr>
+              <w:t xml:space="preserve">Web Alert Experience</w:t>
+            </w:r>
+          </w:p>
+        </w:tc>
+        <w:tc>
+          <w:tcPr>
+            <w:tcW w:type="dxa" w:w="2256"/>
+            <w:tcBorders>
+              <w:top w:val="single" w:color="999999" w:sz="4"/>
+              <w:left w:val="single" w:color="999999" w:sz="4"/>
+              <w:bottom w:val="single" w:color="999999" w:sz="4"/>
+              <w:right w:val="single" w:color="999999" w:sz="4"/>
+            </w:tcBorders>
+            <w:shd w:fill="FFFFFF" w:val="clear"/>
+            <w:tcMar>
+              <w:top w:type="dxa" w:w="80"/>
+              <w:left w:type="dxa" w:w="120"/>
+              <w:bottom w:type="dxa" w:w="80"/>
+              <w:right w:type="dxa" w:w="120"/>
+            </w:tcMar>
+          </w:tcPr>
+          <w:p>
+            <w:pPr>
+              <w:spacing w:after="0" w:before="0"/>
+            </w:pPr>
+            <w:r>
+              <w:rPr>
+                <w:rFonts w:ascii="Times New Roman" w:cs="Times New Roman" w:eastAsia="Times New Roman" w:hAnsi="Times New Roman"/>
+                <w:b w:val="false"/>
+                <w:bCs w:val="false"/>
+                <w:color w:val="000000"/>
+                <w:sz w:val="22"/>
+                <w:szCs w:val="22"/>
+              </w:rPr>
+              <w:t xml:space="preserve">Unread report indicators, browser alert sound preferences, test alert action, and service-worker integration point</w:t>
+            </w:r>
+          </w:p>
+        </w:tc>
+        <w:tc>
+          <w:tcPr>
+            <w:tcW w:type="dxa" w:w="2256"/>
+            <w:tcBorders>
+              <w:top w:val="single" w:color="999999" w:sz="4"/>
+              <w:left w:val="single" w:color="999999" w:sz="4"/>
+              <w:bottom w:val="single" w:color="999999" w:sz="4"/>
+              <w:right w:val="single" w:color="999999" w:sz="4"/>
+            </w:tcBorders>
+            <w:shd w:fill="FFFFFF" w:val="clear"/>
+            <w:tcMar>
+              <w:top w:type="dxa" w:w="80"/>
+              <w:left w:type="dxa" w:w="120"/>
+              <w:bottom w:type="dxa" w:w="80"/>
+              <w:right w:type="dxa" w:w="120"/>
+            </w:tcMar>
+          </w:tcPr>
+          <w:p>
+            <w:pPr>
+              <w:spacing w:after="0" w:before="0"/>
+            </w:pPr>
+            <w:r>
+              <w:rPr>
+                <w:rFonts w:ascii="Times New Roman" w:cs="Times New Roman" w:eastAsia="Times New Roman" w:hAnsi="Times New Roman"/>
+                <w:b w:val="false"/>
+                <w:bCs w:val="false"/>
+                <w:color w:val="000000"/>
+                <w:sz w:val="22"/>
+                <w:szCs w:val="22"/>
+              </w:rPr>
+              <w:t xml:space="preserve">Implemented with deployment prerequisite</w:t>
+            </w:r>
+          </w:p>
+        </w:tc>
+        <w:tc>
+          <w:tcPr>
+            <w:tcW w:type="dxa" w:w="2258"/>
+            <w:tcBorders>
+              <w:top w:val="single" w:color="999999" w:sz="4"/>
+              <w:left w:val="single" w:color="999999" w:sz="4"/>
+              <w:bottom w:val="single" w:color="999999" w:sz="4"/>
+              <w:right w:val="single" w:color="999999" w:sz="4"/>
+            </w:tcBorders>
+            <w:shd w:fill="FFFFFF" w:val="clear"/>
+            <w:tcMar>
+              <w:top w:type="dxa" w:w="80"/>
+              <w:left w:type="dxa" w:w="120"/>
+              <w:bottom w:type="dxa" w:w="80"/>
+              <w:right w:type="dxa" w:w="120"/>
+            </w:tcMar>
+          </w:tcPr>
+          <w:p>
+            <w:pPr>
+              <w:spacing w:after="0" w:before="0"/>
+            </w:pPr>
+            <w:r>
+              <w:rPr>
+                <w:rFonts w:ascii="Times New Roman" w:cs="Times New Roman" w:eastAsia="Times New Roman" w:hAnsi="Times New Roman"/>
+                <w:b w:val="false"/>
+                <w:bCs w:val="false"/>
+                <w:color w:val="000000"/>
+                <w:sz w:val="22"/>
+                <w:szCs w:val="22"/>
+              </w:rPr>
+              <w:t xml:space="preserve">shared.js, auth.js, firebase-messaging-sw.js</w:t>
             </w:r>
           </w:p>
         </w:tc>
@@ -20414,7 +20571,7 @@
           <w:sz w:val="24"/>
           <w:szCs w:val="24"/>
         </w:rPr>
-        <w:t xml:space="preserve">This section presents the complete user interface of the MyBahaya system across all screens of the Flutter mobile application, the organisation web dashboard, and the administrator portal. The screenshots were captured from the deployed production build.</w:t>
+        <w:t xml:space="preserve">This section presents the complete user interface of the MyBahaya system across all screens of the Flutter mobile application, the organisation web dashboard, and the administrator portal. The figures document the implemented screens and current repository behavior; final deployment screenshots can be attached as supplementary evidence.</w:t>
       </w:r>
     </w:p>
     <w:p>
@@ -21205,7 +21362,7 @@
           <w:sz w:val="24"/>
           <w:szCs w:val="24"/>
         </w:rPr>
-        <w:t xml:space="preserve">Figure 5.12 shows the My Reports screen, which lists all reports previously submitted by the authenticated citizen in reverse chronological order, with status badges. Figure 5.13 shows the Report Detail screen for an individual report, displaying the submitted photos, AI-generated analysis (severity, summary, hazards), the assigned organisation, and the current status.</w:t>
+        <w:t xml:space="preserve">Figure 5.12 shows the My Reports screen, which lists all reports previously submitted by the authenticated citizen in reverse chronological order, with a status badge for each entry (NEW, RECEIVED, IN_PROGRESS, or RESOLVED). Figure 5.13 shows the Report Detail screen for an individual report, displaying the submitted photos, the incident category, description, assigned organisation name, ETA in minutes, and the current status timeline.</w:t>
       </w:r>
     </w:p>
     <w:tbl>
@@ -21345,7 +21502,7 @@
                 <w:sz w:val="22"/>
                 <w:szCs w:val="22"/>
               </w:rPr>
-              <w:t xml:space="preserve">[ Flutter app: Report detail with AI analysis panel ]</w:t>
+              <w:t xml:space="preserve">[ Flutter app: Report detail screen (status, assigned org, ETA, photos) ]</w:t>
             </w:r>
           </w:p>
         </w:tc>
@@ -21375,7 +21532,7 @@
           <w:sz w:val="22"/>
           <w:szCs w:val="22"/>
         </w:rPr>
-        <w:t xml:space="preserve">Mobile Application — Report Detail with AI Analysis</w:t>
+        <w:t xml:space="preserve">Mobile Application — Report Detail Screen</w:t>
       </w:r>
     </w:p>
     <w:p>
@@ -21653,7 +21810,7 @@
           <w:sz w:val="24"/>
           <w:szCs w:val="24"/>
         </w:rPr>
-        <w:t xml:space="preserve">The following figures document all major screens of the MyBahaya organisation web dashboard, used by emergency response organisations to manage their assigned reports.</w:t>
+        <w:t xml:space="preserve">The following figures document the current browser-based MyBahaya dashboard. The implementation is shared by authorized organization users and administrators, with the auth guard limiting data and navigation according to the resolved role.</w:t>
       </w:r>
     </w:p>
     <w:p>
@@ -21929,7 +22086,7 @@
           <w:sz w:val="24"/>
           <w:szCs w:val="24"/>
         </w:rPr>
-        <w:t xml:space="preserve">Figure 5.18 shows the report management table, which lists all reports assigned to the organisation. Columns include report ID, category, submission time, status badge, and an action button to open the full detail view. Reports can be filtered by status and sorted by date.</w:t>
+        <w:t xml:space="preserve">Figure 5.18 shows the current Reports Centre. It groups reports into Active, Marked as En Route, and Solved workflow views and adds search, Malaysia/state scope, category filters, newest/oldest sorting, unread markers, and a Mark All Opened control. The grouping is a presentation layer over the backend status values and does not change the stored workflow state.</w:t>
       </w:r>
     </w:p>
     <w:tbl>
@@ -22048,7 +22205,7 @@
           <w:sz w:val="24"/>
           <w:szCs w:val="24"/>
         </w:rPr>
-        <w:t xml:space="preserve">Figure 5.19 shows the report detail view, which displays the submitted photos, the incident GPS location, the AI enrichment panel (severity rating, summary, detected hazards, suggested category, and fake-report flag), and the status update controls with ETA input.</w:t>
+        <w:t xml:space="preserve">Figure 5.19 shows the report detail modal, which supports photo thumbnails, optional video playback, reverse-geocoded location text, the AI enrichment panel (severity rating, summary, detected hazards, suggested category, and fake-report flag), report verification or rejection, and status transition controls.</w:t>
       </w:r>
     </w:p>
     <w:tbl>
@@ -22167,7 +22324,7 @@
           <w:sz w:val="24"/>
           <w:szCs w:val="24"/>
         </w:rPr>
-        <w:t xml:space="preserve">Figure 5.20 shows the interactive Leaflet.js map view, which plots all incident markers assigned to the organisation on an OpenStreetMap base layer. Clicking a marker opens a popup with the report category, status, and a link to the full detail view.</w:t>
+        <w:t xml:space="preserve">Figure 5.20 shows the interactive MapLibre map view, which listens for report changes in Firestore, groups reports at the same location, supports category filtering, displays live totals and category counts, and lists recent activity. Zoom, locate, and marker-focus controls support operational monitoring.</w:t>
       </w:r>
     </w:p>
     <w:tbl>
@@ -22218,7 +22375,7 @@
                 <w:sz w:val="22"/>
                 <w:szCs w:val="22"/>
               </w:rPr>
-              <w:t xml:space="preserve">[ Web dashboard: Incident map view (Leaflet.js) ]</w:t>
+              <w:t xml:space="preserve">[ Web dashboard: Incident map view (MapLibre) ]</w:t>
             </w:r>
           </w:p>
         </w:tc>
@@ -22248,7 +22405,7 @@
           <w:sz w:val="22"/>
           <w:szCs w:val="22"/>
         </w:rPr>
-        <w:t xml:space="preserve">Organisation Web Dashboard — Incident Map View</w:t>
+        <w:t xml:space="preserve">Organisation Web Dashboard — Incident Map View (MapLibre)</w:t>
       </w:r>
     </w:p>
     <w:p>
@@ -22286,7 +22443,7 @@
           <w:sz w:val="24"/>
           <w:szCs w:val="24"/>
         </w:rPr>
-        <w:t xml:space="preserve">Figure 5.21 shows the analytics dashboard, which presents Chart.js bar and doughnut charts visualising the distribution of assigned reports by category and by status. This view enables supervisors to identify incident trends and monitor team workload over time.</w:t>
+        <w:t xml:space="preserve">Figure 5.21 shows the analytics dashboard, which supports seven-day, thirty-day, ninety-day, and all-time views. It provides KPI cards, daily trend, category split, hourly pattern, category bars, day-of-week analysis, recent reports, and CSV export. These values are calculated from Firestore report data in the browser.</w:t>
       </w:r>
     </w:p>
     <w:tbl>
@@ -22923,7 +23080,7 @@
           <w:sz w:val="24"/>
           <w:szCs w:val="24"/>
         </w:rPr>
-        <w:t xml:space="preserve">All planned modules for the MyBahaya FYP 1 scope have been successfully implemented. The system is deployed on a production VPS with HTTPS access, and all major features — report submission, AI enrichment, geolocation routing, FCM notifications, and the organisation web dashboard — are operational. The complete user interface across all three portals (citizen mobile application, organisation web dashboard, and administrator portal) has been documented in Section 5.5. Chapter 6 will present the testing strategy and results for the implemented system.</w:t>
+        <w:t xml:space="preserve">The current repository contains the major implementation modules for report submission, AI enrichment, geolocation routing, notification logic, citizen mobile screens, and the browser dashboard. The latest web work is documented in Section 5.5, including the Active/En Route/Solved workflow views, unread-report indicators, sound alerts, live map, analytics, CSV export, verification, and organization administration. External deployment configuration is treated separately from implemented source functionality. Chapter 6 presents the testing strategy and results.</w:t>
       </w:r>
     </w:p>
     <w:p>
@@ -23043,7 +23200,7 @@
           <w:sz w:val="24"/>
           <w:szCs w:val="24"/>
         </w:rPr>
-        <w:t xml:space="preserve">Testing was conducted by the developer (Ahmad Shukri) acting in the capacity of both the test designer and primary tester. User acceptance testing was conducted with a small group of five representative users comprising two students acting as citizen users and three colleagues acting as organization staff users. Feedback from user acceptance testing was incorporated into bug fixes prior to final submission.</w:t>
+        <w:t xml:space="preserve">Testing was conducted by the developer (Ahmad Shukri) acting as both test designer and primary reviewer. The current evidence in this report is based on implementation review, source-level traceability, and manual interface checks. A separate formal UAT session with named participants, timings, and signed results should be attached when it is conducted against the configured deployment.</w:t>
       </w:r>
     </w:p>
     <w:p>
@@ -23083,7 +23240,7 @@
           <w:sz w:val="24"/>
           <w:szCs w:val="24"/>
         </w:rPr>
-        <w:t xml:space="preserve">Testing was conducted in the following environment:</w:t>
+        <w:t xml:space="preserve">Testing was conducted using the repository implementation and its local development configuration. The results below distinguish implementation-level verification from checks that require configured external services.</w:t>
       </w:r>
     </w:p>
     <w:p>
@@ -23102,7 +23259,7 @@
           <w:sz w:val="24"/>
           <w:szCs w:val="24"/>
         </w:rPr>
-        <w:t xml:space="preserve">Mobile Application: Physical Android device (Android 14) and Android Emulator (API Level 34) via Android Studio.</w:t>
+        <w:t xml:space="preserve">Mobile Application: Flutter project inspected for authentication, report submission, location, media, map, alerts, profile, and report-history flows.</w:t>
       </w:r>
     </w:p>
     <w:p>
@@ -23121,7 +23278,7 @@
           <w:sz w:val="24"/>
           <w:szCs w:val="24"/>
         </w:rPr>
-        <w:t xml:space="preserve">Web Dashboard: Google Chrome (latest version) on macOS. Cross-browser compatibility was additionally verified on Firefox.</w:t>
+        <w:t xml:space="preserve">Web Dashboard: Static HTML/CSS/JavaScript pages inspected in a modern Chromium browser with Firebase web SDK, MapLibre, Chart.js, and service-worker integration points.</w:t>
       </w:r>
     </w:p>
     <w:p>
@@ -23140,7 +23297,7 @@
           <w:sz w:val="24"/>
           <w:szCs w:val="24"/>
         </w:rPr>
-        <w:t xml:space="preserve">Backend API: Tested via Postman for individual endpoint validation. Integration tests executed against the production VPS (api.mybahaya.com).</w:t>
+        <w:t xml:space="preserve">Backend API: Spring Boot controller, security filter, routing, report service, MinIO service, AI service, and FCM service reviewed together with the available Maven test class.</w:t>
       </w:r>
     </w:p>
     <w:p>
@@ -23178,7 +23335,7 @@
           <w:sz w:val="24"/>
           <w:szCs w:val="24"/>
         </w:rPr>
-        <w:t xml:space="preserve">AI Pipeline: Gemini API responses validated using a sample set of 20 incident images across all supported categories.</w:t>
+        <w:t xml:space="preserve">External-service checks: Firebase credentials, MinIO availability, Gemini API key, FCM configuration, and a valid Web Push VAPID key are required for full end-to-end execution and were recorded as deployment prerequisites.</w:t>
       </w:r>
     </w:p>
     <w:p>
@@ -24842,7 +24999,7 @@
                 <w:sz w:val="22"/>
                 <w:szCs w:val="22"/>
               </w:rPr>
-              <w:t xml:space="preserve">Submit report within 5 km of a registered citizen user</w:t>
+              <w:t xml:space="preserve">Submit a report with nearby-alert logic enabled</w:t>
             </w:r>
           </w:p>
         </w:tc>
@@ -24876,7 +25033,7 @@
                 <w:sz w:val="22"/>
                 <w:szCs w:val="22"/>
               </w:rPr>
-              <w:t xml:space="preserve">Citizen receives push notification within 10 seconds</w:t>
+              <w:t xml:space="preserve">Nearby-alert dispatch is invoked; actual device delivery is measured in the configured Firebase environment</w:t>
             </w:r>
           </w:p>
         </w:tc>
@@ -24946,7 +25103,7 @@
                 <w:sz w:val="22"/>
                 <w:szCs w:val="22"/>
               </w:rPr>
-              <w:t xml:space="preserve">FCM — Org Assignment</w:t>
+              <w:t xml:space="preserve">Web Alerting</w:t>
             </w:r>
           </w:p>
         </w:tc>
@@ -24980,7 +25137,7 @@
                 <w:sz w:val="22"/>
                 <w:szCs w:val="22"/>
               </w:rPr>
-              <w:t xml:space="preserve">New report assigned to organization</w:t>
+              <w:t xml:space="preserve">New report arrives while the organization dashboard is open</w:t>
             </w:r>
           </w:p>
         </w:tc>
@@ -25014,7 +25171,7 @@
                 <w:sz w:val="22"/>
                 <w:szCs w:val="22"/>
               </w:rPr>
-              <w:t xml:space="preserve">Organization receives browser push notification</w:t>
+              <w:t xml:space="preserve">Unread indicator and alert sound are triggered; browser push is available when VAPID is configured</w:t>
             </w:r>
           </w:p>
         </w:tc>
@@ -25256,7 +25413,7 @@
                 <w:sz w:val="22"/>
                 <w:szCs w:val="22"/>
               </w:rPr>
-              <w:t xml:space="preserve">Update report status from RECEIVED to IN_PROGRESS</w:t>
+              <w:t xml:space="preserve">Advance a report through the dashboard workflow</w:t>
             </w:r>
           </w:p>
         </w:tc>
@@ -25290,7 +25447,7 @@
                 <w:sz w:val="22"/>
                 <w:szCs w:val="22"/>
               </w:rPr>
-              <w:t xml:space="preserve">Firestore status updated; citizen receives FCM status update</w:t>
+              <w:t xml:space="preserve">PATCH endpoint updates Firestore and the report moves between Active, En Route, and Solved views</w:t>
             </w:r>
           </w:p>
         </w:tc>
@@ -25670,7 +25827,7 @@
                 <w:sz w:val="22"/>
                 <w:szCs w:val="22"/>
               </w:rPr>
-              <w:t xml:space="preserve">Measure report submission response time (single photo)</w:t>
+              <w:t xml:space="preserve">Load dashboard data and render reports, charts, and map markers</w:t>
             </w:r>
           </w:p>
         </w:tc>
@@ -25704,7 +25861,7 @@
                 <w:sz w:val="22"/>
                 <w:szCs w:val="22"/>
               </w:rPr>
-              <w:t xml:space="preserve">Response received within 3 seconds</w:t>
+              <w:t xml:space="preserve">Page remains usable and updates from Firestore without blocking the interface</w:t>
             </w:r>
           </w:p>
         </w:tc>
@@ -25808,7 +25965,7 @@
                 <w:sz w:val="22"/>
                 <w:szCs w:val="22"/>
               </w:rPr>
-              <w:t xml:space="preserve">Complete full report submission flow from app open to confirmation</w:t>
+              <w:t xml:space="preserve">Use report filters, unread controls, media modal, analytics timeframe, and CSV export</w:t>
             </w:r>
           </w:p>
         </w:tc>
@@ -25842,7 +25999,7 @@
                 <w:sz w:val="22"/>
                 <w:szCs w:val="22"/>
               </w:rPr>
-              <w:t xml:space="preserve">Completed within 60 seconds by all 5 UAT users</w:t>
+              <w:t xml:space="preserve">Controls are discoverable, responsive, and produce the expected filtered or exported output</w:t>
             </w:r>
           </w:p>
         </w:tc>
@@ -26239,7 +26396,7 @@
                 <w:sz w:val="22"/>
                 <w:szCs w:val="22"/>
               </w:rPr>
-              <w:t xml:space="preserve">Registration flow completed successfully across all test devices</w:t>
+              <w:t xml:space="preserve">Firebase Authentication registration path is implemented and connected to the mobile flow</w:t>
             </w:r>
           </w:p>
         </w:tc>
@@ -26343,7 +26500,7 @@
                 <w:sz w:val="22"/>
                 <w:szCs w:val="22"/>
               </w:rPr>
-              <w:t xml:space="preserve">Firebase Auth error correctly surfaced to UI</w:t>
+              <w:t xml:space="preserve">Firebase Auth errors are surfaced to the authentication UI</w:t>
             </w:r>
           </w:p>
         </w:tc>
@@ -26447,7 +26604,7 @@
                 <w:sz w:val="22"/>
                 <w:szCs w:val="22"/>
               </w:rPr>
-              <w:t xml:space="preserve">Report saved in Firestore; org notification received within 5 seconds</w:t>
+              <w:t xml:space="preserve">Report controller accepts authenticated multipart submission and report service persists routing and report data</w:t>
             </w:r>
           </w:p>
         </w:tc>
@@ -26551,7 +26708,7 @@
                 <w:sz w:val="22"/>
                 <w:szCs w:val="22"/>
               </w:rPr>
-              <w:t xml:space="preserve">Submit button correctly disabled without category selection</w:t>
+              <w:t xml:space="preserve">Mobile report flow validates required category and media before submission</w:t>
             </w:r>
           </w:p>
         </w:tc>
@@ -26655,7 +26812,7 @@
                 <w:sz w:val="22"/>
                 <w:szCs w:val="22"/>
               </w:rPr>
-              <w:t xml:space="preserve">Location error message displayed; submission blocked</w:t>
+              <w:t xml:space="preserve">Location is required by the report flow and missing location is handled as an error</w:t>
             </w:r>
           </w:p>
         </w:tc>
@@ -26759,7 +26916,7 @@
                 <w:sz w:val="22"/>
                 <w:szCs w:val="22"/>
               </w:rPr>
-              <w:t xml:space="preserve">AI enrichment completed within 25 seconds for standard JPEG images</w:t>
+              <w:t xml:space="preserve">AI enrichment service writes structured severity, summary, hazards, category, and fake-report fields</w:t>
             </w:r>
           </w:p>
         </w:tc>
@@ -26863,7 +27020,7 @@
                 <w:sz w:val="22"/>
                 <w:szCs w:val="22"/>
               </w:rPr>
-              <w:t xml:space="preserve">Gemini correctly flagged non-emergency images in 4 out of 5 cases</w:t>
+              <w:t xml:space="preserve">AI response parsing includes the looksFake field; accuracy still requires a configured image test set</w:t>
             </w:r>
           </w:p>
         </w:tc>
@@ -26967,7 +27124,7 @@
                 <w:sz w:val="22"/>
                 <w:szCs w:val="22"/>
               </w:rPr>
-              <w:t xml:space="preserve">Nearest fire station correctly assigned using Haversine routing</w:t>
+              <w:t xml:space="preserve">Routing service filters active organizations by type and applies Haversine distance</w:t>
             </w:r>
           </w:p>
         </w:tc>
@@ -27071,7 +27228,7 @@
                 <w:sz w:val="22"/>
                 <w:szCs w:val="22"/>
               </w:rPr>
-              <w:t xml:space="preserve">FCM push notification delivered to citizen within 8 seconds</w:t>
+              <w:t xml:space="preserve">Nearby-alert dispatch logic is implemented; delivery time requires configured Firebase devices</w:t>
             </w:r>
           </w:p>
         </w:tc>
@@ -27141,7 +27298,7 @@
                 <w:sz w:val="22"/>
                 <w:szCs w:val="22"/>
               </w:rPr>
-              <w:t xml:space="preserve">Pass</w:t>
+              <w:t xml:space="preserve">Conditional</w:t>
             </w:r>
           </w:p>
         </w:tc>
@@ -27175,7 +27332,7 @@
                 <w:sz w:val="22"/>
                 <w:szCs w:val="22"/>
               </w:rPr>
-              <w:t xml:space="preserve">Organization browser notification received upon new assignment</w:t>
+              <w:t xml:space="preserve">Unread indicator and in-page chime are implemented; background browser push depends on replacing the VAPID placeholder with a project key</w:t>
             </w:r>
           </w:p>
         </w:tc>
@@ -27279,7 +27436,7 @@
                 <w:sz w:val="22"/>
                 <w:szCs w:val="22"/>
               </w:rPr>
-              <w:t xml:space="preserve">Organization dashboard filtered correctly by assignedOrgId</w:t>
+              <w:t xml:space="preserve">Auth role resolution and organization-scoped report querying are implemented</w:t>
             </w:r>
           </w:p>
         </w:tc>
@@ -27383,7 +27540,7 @@
                 <w:sz w:val="22"/>
                 <w:szCs w:val="22"/>
               </w:rPr>
-              <w:t xml:space="preserve">Status update persisted to Firestore; citizen FCM notification sent</w:t>
+              <w:t xml:space="preserve">Status PATCH flow and the Active/En Route/Solved presentation grouping are implemented</w:t>
             </w:r>
           </w:p>
         </w:tc>
@@ -27487,7 +27644,7 @@
                 <w:sz w:val="22"/>
                 <w:szCs w:val="22"/>
               </w:rPr>
-              <w:t xml:space="preserve">Unauthenticated request returned HTTP 401 as expected</w:t>
+              <w:t xml:space="preserve">Security configuration and controller checks require authentication for protected report operations</w:t>
             </w:r>
           </w:p>
         </w:tc>
@@ -27591,7 +27748,7 @@
                 <w:sz w:val="22"/>
                 <w:szCs w:val="22"/>
               </w:rPr>
-              <w:t xml:space="preserve">Cross-org report access correctly blocked by Firestore query filter</w:t>
+              <w:t xml:space="preserve">Organization role resolution and assigned-organization filtering limit the dashboard dataset</w:t>
             </w:r>
           </w:p>
         </w:tc>
@@ -27695,7 +27852,7 @@
                 <w:sz w:val="22"/>
                 <w:szCs w:val="22"/>
               </w:rPr>
-              <w:t xml:space="preserve">Average response time 1.8 seconds (well within 3-second requirement)</w:t>
+              <w:t xml:space="preserve">The web interface uses asynchronous Firestore listeners and client-side rendering; no blocking wait is introduced by the dashboard controls</w:t>
             </w:r>
           </w:p>
         </w:tc>
@@ -27799,7 +27956,7 @@
                 <w:sz w:val="22"/>
                 <w:szCs w:val="22"/>
               </w:rPr>
-              <w:t xml:space="preserve">All 5 UAT users completed report submission within 45 seconds on average</w:t>
+              <w:t xml:space="preserve">Filter, sorting, unread, media, analytics timeframe, and CSV export handlers are present and connected to the corresponding controls</w:t>
             </w:r>
           </w:p>
         </w:tc>
@@ -27825,7 +27982,7 @@
           <w:sz w:val="24"/>
           <w:szCs w:val="24"/>
         </w:rPr>
-        <w:t xml:space="preserve">All 16 test cases passed successfully. User acceptance testing feedback was generally positive. Users found the report submission process intuitive and appreciated the immediate organization assignment feedback shown after submission. One UAT participant noted that the camera capture flow could be further streamlined by defaulting to the camera directly rather than presenting a picker menu — this enhancement has been noted for a future improvement sprint.</w:t>
+        <w:t xml:space="preserve">The implementation review found the core report, dashboard, filtering, map, analytics, moderation, and status-management flows present and connected. TC-10 is conditional because the current web authentication file contains a placeholder Web Push VAPID key; in-page unread indicators and alert sounds remain implemented, but background browser push cannot be claimed until that deployment value is configured. Exact network latency, Gemini accuracy, FCM delivery time, and human UAT timing should be measured again in the target deployment rather than presented as repository-derived facts.</w:t>
       </w:r>
     </w:p>
     <w:p>
@@ -27865,7 +28022,7 @@
           <w:sz w:val="24"/>
           <w:szCs w:val="24"/>
         </w:rPr>
-        <w:t xml:space="preserve">The testing phase confirms that the MyBahaya system correctly implements all specified functional and non-functional requirements. All 16 test cases passed, and user acceptance testing yielded positive feedback from representative users. The AI enrichment pipeline demonstrated satisfactory performance with an average processing time of 25 seconds and correct fake report detection in 80% of test cases. Chapter 7 will present the overall conclusions, strengths, weaknesses, and future directions of the project.</w:t>
+        <w:t xml:space="preserve">The testing phase confirms that the principal implemented flows are represented in the current codebase and that the web dashboard changes are covered by explicit checks. Fifteen checks passed at implementation level and one alerting check remains conditional on Web Push VAPID configuration. Performance measurements, AI accuracy, notification delivery time, and formal user acceptance timing require execution against configured services and should be added as deployment evidence. Chapter 7 presents the overall conclusions, strengths, weaknesses, and future directions of the project.</w:t>
       </w:r>
     </w:p>
     <w:p>
@@ -27947,7 +28104,7 @@
           <w:sz w:val="24"/>
           <w:szCs w:val="24"/>
         </w:rPr>
-        <w:t xml:space="preserve">End-to-End Integration: MyBahaya successfully integrates five distinct technology layers (mobile app, backend API, AI analysis, NoSQL database, object storage, and push notifications) into a coherent, working system. This level of integration demonstrates the viability of the proposed architecture for production deployment.</w:t>
+        <w:t xml:space="preserve">End-to-End Integration: MyBahaya integrates the mobile app, backend API, AI analysis, NoSQL database, object storage, web dashboard, and notification logic into a coherent system. This demonstrates the viability of the architecture for a configured deployment.</w:t>
       </w:r>
     </w:p>
     <w:p>
@@ -27985,7 +28142,7 @@
           <w:sz w:val="24"/>
           <w:szCs w:val="24"/>
         </w:rPr>
-        <w:t xml:space="preserve">Real-Time Community Alerting: The FCM-based proximity alert system successfully delivers notifications to nearby citizens within 10 seconds of report submission, demonstrating the platform's capability for real-time community safety communication.</w:t>
+        <w:t xml:space="preserve">Real-Time Community Alerting: The platform contains proximity-based notification logic for nearby citizens, mobile FCM handling, and dashboard-side real-time indicators and alert sounds. Delivery timing depends on Firebase and browser configuration and must be measured in the target deployment.</w:t>
       </w:r>
     </w:p>
     <w:p>
@@ -28023,7 +28180,7 @@
           <w:sz w:val="24"/>
           <w:szCs w:val="24"/>
         </w:rPr>
-        <w:t xml:space="preserve">Rapid Submission Flow: The average report submission time of 45 seconds (from app open to confirmation) significantly exceeds the usability requirement of 60 seconds, demonstrating a genuinely faster alternative to calling 999.</w:t>
+        <w:t xml:space="preserve">Clear Operational Workflow: The current dashboard makes report state visible through Active, En Route, and Solved groupings, unread indicators, media review, map context, and analytics, helping organization users prioritize incoming incidents.</w:t>
       </w:r>
     </w:p>
     <w:p>
@@ -28354,7 +28511,7 @@
           <w:sz w:val="24"/>
           <w:szCs w:val="24"/>
         </w:rPr>
-        <w:t xml:space="preserve">Technical Contribution: The project produces a complete, deployed, multi-platform emergency reporting system with open-source-compatible components (Flutter, Spring Boot, OpenStreetMap, MinIO). The codebase demonstrates best practices for JWT-secured REST API design, asynchronous AI processing, and Firebase-Flutter integration.</w:t>
+        <w:t xml:space="preserve">Technical Contribution: The project produces a multi-platform emergency reporting system with open-source-compatible components (Flutter, Spring Boot, MapLibre/OpenStreetMap, MinIO). The codebase demonstrates authenticated REST API design, asynchronous AI processing, Firebase integration, real-time web listeners, and browser-side operational tooling.</w:t>
       </w:r>
     </w:p>
     <w:p>
@@ -28428,7 +28585,7 @@
           <w:sz w:val="24"/>
           <w:szCs w:val="24"/>
         </w:rPr>
-        <w:t xml:space="preserve">The MyBahaya project has successfully achieved all five stated objectives: a functional citizen mobile application with multimedia report submission was developed; an AI analysis pipeline using Google Gemini 2.5 Flash was implemented and validated; an intelligent geolocation routing system was built and tested; a web dashboard for emergency organizations was deployed; and a real-time FCM push notification system was integrated for both citizen alerts and organization assignments.</w:t>
+        <w:t xml:space="preserve">The MyBahaya project has implemented the principal objectives: a citizen mobile application with multimedia report submission; an AI enrichment pipeline using Google Gemini 2.5 Flash; geolocation-based organization routing; a browser dashboard for report operations; and notification logic for citizens and organizations. The latest web implementation further adds workflow grouping, unread indicators, live map monitoring, richer analytics, CSV export, verification controls, organization administration, and configurable alert sounds.</w:t>
       </w:r>
     </w:p>
     <w:p>
@@ -28443,7 +28600,7 @@
           <w:sz w:val="24"/>
           <w:szCs w:val="24"/>
         </w:rPr>
-        <w:t xml:space="preserve">Testing confirmed that all 16 test cases passed and user acceptance testing yielded positive feedback. The average report submission time of 45 seconds demonstrates that MyBahaya is not only technically functional but genuinely usable under realistic conditions.</w:t>
+        <w:t xml:space="preserve">Testing found fifteen implementation-level checks passing and one browser-alert check conditional on the Web Push VAPID configuration. This result is more defensible than claiming universal end-to-end success without a configured Firebase, MinIO, Gemini, and browser-push environment. Formal latency, AI-accuracy, notification-delivery, and user-acceptance measurements remain deployment evidence to collect.</w:t>
       </w:r>
     </w:p>
     <w:p>
@@ -28458,7 +28615,7 @@
           <w:sz w:val="24"/>
           <w:szCs w:val="24"/>
         </w:rPr>
-        <w:t xml:space="preserve">While several areas for improvement have been identified — particularly offline capability, live video streaming, and more sophisticated routing — these represent natural extensions for the FYP 2 phase rather than deficiencies in the current implementation. The core platform is stable, deployed, and ready for further enhancement.</w:t>
+        <w:t xml:space="preserve">The main limitations are offline operation, dependence on image quality and external AI services, simplified ETA estimation, direct asynchronous AI processing without a durable queue, and the browser-push configuration prerequisite. These are clear next steps for further development rather than reasons to omit the implemented web improvements from the report.</w:t>
       </w:r>
     </w:p>
     <w:p>
@@ -28575,7 +28732,7 @@
           <w:sz w:val="24"/>
           <w:szCs w:val="24"/>
         </w:rPr>
-        <w:t xml:space="preserve">Leaflet (2024). Leaflet JavaScript Library Documentation (v1.9). Available at: https://leafletjs.com (Accessed: 29 June 2026).</w:t>
+        <w:t xml:space="preserve">MapLibre (2024). MapLibre GL JS Documentation. Available at: https://maplibre.org/maplibre-gl-js/docs/ (Accessed: 11 September 2026).</w:t>
       </w:r>
     </w:p>
     <w:p>

</xml_diff>